<commit_message>
MQTT lab: real results and screenshots; remove cloud practical
</commit_message>
<xml_diff>
--- a/04-lab-mqtt/Лабораторная_MQTT_Кайназар.docx
+++ b/04-lab-mqtt/Лабораторная_MQTT_Кайназар.docx
@@ -145,9 +145,8 @@
       <w:r>
         <w:rPr>
           <w:color w:val="1A3C8C"/>
-          <w:highlight w:val="yellow"/>
-        </w:rPr>
-        <w:t>lab/&lt;ГРУППА&gt;/&lt;N&gt;/</w:t>
+        </w:rPr>
+        <w:t>lab/67/67/  (группа 67, вариант 67)</w:t>
       </w:r>
     </w:p>
     <w:p>
@@ -702,20 +701,53 @@
     </w:p>
     <w:p>
       <w:pPr>
+        <w:jc w:val="center"/>
+      </w:pPr>
+      <w:r>
+        <w:drawing>
+          <wp:inline xmlns:a="http://schemas.openxmlformats.org/drawingml/2006/main" xmlns:pic="http://schemas.openxmlformats.org/drawingml/2006/picture">
+            <wp:extent cx="4140000" cy="3105000"/>
+            <wp:docPr id="1" name="Picture 1"/>
+            <wp:cNvGraphicFramePr>
+              <a:graphicFrameLocks noChangeAspect="1"/>
+            </wp:cNvGraphicFramePr>
+            <a:graphic>
+              <a:graphicData uri="http://schemas.openxmlformats.org/drawingml/2006/picture">
+                <pic:pic>
+                  <pic:nvPicPr>
+                    <pic:cNvPr id="0" name="mqtt1.jpg"/>
+                    <pic:cNvPicPr/>
+                  </pic:nvPicPr>
+                  <pic:blipFill>
+                    <a:blip r:embed="rId7"/>
+                    <a:stretch>
+                      <a:fillRect/>
+                    </a:stretch>
+                  </pic:blipFill>
+                  <pic:spPr>
+                    <a:xfrm>
+                      <a:off x="0" y="0"/>
+                      <a:ext cx="4140000" cy="3105000"/>
+                    </a:xfrm>
+                    <a:prstGeom prst="rect"/>
+                  </pic:spPr>
+                </pic:pic>
+              </a:graphicData>
+            </a:graphic>
+          </wp:inline>
+        </w:drawing>
+      </w:r>
+    </w:p>
+    <w:p>
+      <w:pPr>
         <w:spacing w:after="80"/>
-        <w:ind w:left="357"/>
-      </w:pPr>
-      <w:r>
-        <w:rPr>
-          <w:color w:val="1A3C8C"/>
-        </w:rPr>
-      </w:r>
-      <w:r>
-        <w:rPr>
-          <w:color w:val="1A3C8C"/>
-          <w:highlight w:val="yellow"/>
-        </w:rPr>
-        <w:t>[вставить скриншот № 1]</w:t>
+        <w:jc w:val="center"/>
+      </w:pPr>
+      <w:r>
+        <w:rPr>
+          <w:sz w:val="20"/>
+        </w:rPr>
+        <w:t>Скриншот № 1. Успешное подключение Панель@broker.emqx.io:8084 (wss, MQTT 3.1.1)</w:t>
       </w:r>
     </w:p>
     <w:p>
@@ -920,7 +952,7 @@
         <w:rPr>
           <w:color w:val="1A3C8C"/>
         </w:rPr>
-        <w:t>Наша панель ничего не увидит: она подписана на lab/&lt;ГРУППА&gt;/&lt;N&gt;/#, а сообщение ушло в чужую ветку. Его получит тот, кто подписан на префикс с другим номером. Брокер доставляет сообщения только по совпадению топика с подпиской.</w:t>
+        <w:t>Наша панель ничего не увидит: она подписана на lab/67/67/#, а сообщение ушло в чужую ветку lab/67/68/test. Его получит тот, кто подписан на префикс с другим номером. Брокер доставляет сообщения только по совпадению топика с подпиской.</w:t>
       </w:r>
     </w:p>
     <w:p>
@@ -1635,20 +1667,53 @@
     </w:p>
     <w:p>
       <w:pPr>
+        <w:jc w:val="center"/>
+      </w:pPr>
+      <w:r>
+        <w:drawing>
+          <wp:inline xmlns:a="http://schemas.openxmlformats.org/drawingml/2006/main" xmlns:pic="http://schemas.openxmlformats.org/drawingml/2006/picture">
+            <wp:extent cx="4140000" cy="3762225"/>
+            <wp:docPr id="2" name="Picture 2"/>
+            <wp:cNvGraphicFramePr>
+              <a:graphicFrameLocks noChangeAspect="1"/>
+            </wp:cNvGraphicFramePr>
+            <a:graphic>
+              <a:graphicData uri="http://schemas.openxmlformats.org/drawingml/2006/picture">
+                <pic:pic>
+                  <pic:nvPicPr>
+                    <pic:cNvPr id="0" name="mqtt2.jpg"/>
+                    <pic:cNvPicPr/>
+                  </pic:nvPicPr>
+                  <pic:blipFill>
+                    <a:blip r:embed="rId8"/>
+                    <a:stretch>
+                      <a:fillRect/>
+                    </a:stretch>
+                  </pic:blipFill>
+                  <pic:spPr>
+                    <a:xfrm>
+                      <a:off x="0" y="0"/>
+                      <a:ext cx="4140000" cy="3762225"/>
+                    </a:xfrm>
+                    <a:prstGeom prst="rect"/>
+                  </pic:spPr>
+                </pic:pic>
+              </a:graphicData>
+            </a:graphic>
+          </wp:inline>
+        </w:drawing>
+      </w:r>
+    </w:p>
+    <w:p>
+      <w:pPr>
         <w:spacing w:after="80"/>
-        <w:ind w:left="357"/>
-      </w:pPr>
-      <w:r>
-        <w:rPr>
-          <w:color w:val="1A3C8C"/>
-        </w:rPr>
-      </w:r>
-      <w:r>
-        <w:rPr>
-          <w:color w:val="1A3C8C"/>
-          <w:highlight w:val="yellow"/>
-        </w:rPr>
-        <w:t>[вставить скриншот № 2]</w:t>
+        <w:jc w:val="center"/>
+      </w:pPr>
+      <w:r>
+        <w:rPr>
+          <w:sz w:val="20"/>
+        </w:rPr>
+        <w:t>Скриншот № 2. Подписка greenhouse/+/+/temperature получила A, B и E</w:t>
       </w:r>
     </w:p>
     <w:p>
@@ -2375,20 +2440,53 @@
     </w:p>
     <w:p>
       <w:pPr>
+        <w:jc w:val="center"/>
+      </w:pPr>
+      <w:r>
+        <w:drawing>
+          <wp:inline xmlns:a="http://schemas.openxmlformats.org/drawingml/2006/main" xmlns:pic="http://schemas.openxmlformats.org/drawingml/2006/picture">
+            <wp:extent cx="4140000" cy="3762225"/>
+            <wp:docPr id="3" name="Picture 3"/>
+            <wp:cNvGraphicFramePr>
+              <a:graphicFrameLocks noChangeAspect="1"/>
+            </wp:cNvGraphicFramePr>
+            <a:graphic>
+              <a:graphicData uri="http://schemas.openxmlformats.org/drawingml/2006/picture">
+                <pic:pic>
+                  <pic:nvPicPr>
+                    <pic:cNvPr id="0" name="mqtt3.jpg"/>
+                    <pic:cNvPicPr/>
+                  </pic:nvPicPr>
+                  <pic:blipFill>
+                    <a:blip r:embed="rId9"/>
+                    <a:stretch>
+                      <a:fillRect/>
+                    </a:stretch>
+                  </pic:blipFill>
+                  <pic:spPr>
+                    <a:xfrm>
+                      <a:off x="0" y="0"/>
+                      <a:ext cx="4140000" cy="3762225"/>
+                    </a:xfrm>
+                    <a:prstGeom prst="rect"/>
+                  </pic:spPr>
+                </pic:pic>
+              </a:graphicData>
+            </a:graphic>
+          </wp:inline>
+        </w:drawing>
+      </w:r>
+    </w:p>
+    <w:p>
+      <w:pPr>
         <w:spacing w:after="80"/>
-        <w:ind w:left="357"/>
-      </w:pPr>
-      <w:r>
-        <w:rPr>
-          <w:color w:val="1A3C8C"/>
-        </w:rPr>
-      </w:r>
-      <w:r>
-        <w:rPr>
-          <w:color w:val="1A3C8C"/>
-          <w:highlight w:val="yellow"/>
-        </w:rPr>
-        <w:t>[вставить скриншот № 3]</w:t>
+        <w:jc w:val="center"/>
+      </w:pPr>
+      <w:r>
+        <w:rPr>
+          <w:sz w:val="20"/>
+        </w:rPr>
+        <w:t>Скриншот № 3. Статус датчика: online, затем offline от завещания (LWT) после аварийного обрыва</w:t>
       </w:r>
     </w:p>
     <w:p>
@@ -2674,7 +2772,7 @@
         <w:rPr>
           <w:color w:val="1A3C8C"/>
         </w:rPr>
-        <w:t>По стандарту MQTT брокер не обязан хранить сообщения QoS 0 для отключённого клиента: доставка «не более одного раза», без гарантий, поэтому ожидается 0 сообщений. Примечание: у брокера EMQX по умолчанию включено хранение QoS 0 в очереди сессии (mqueue_store_qos0), поэтому на broker.emqx.io они могут прийти, но это настройка конкретного брокера, а не гарантия протокола.</w:t>
+        <w:t>По стандарту MQTT брокер не обязан хранить сообщения QoS 0 для отключённого клиента: доставка «не более одного раза», без гарантий, поэтому теоретически результат меняется на 0. На практике на broker.emqx.io все три сообщения QoS 0 пришли: у EMQX по умолчанию включено хранение QoS 0 в очереди сессии (mqueue_store_qos0). Это настройка конкретного брокера, а не гарантия протокола: другой брокер их потеряет.</w:t>
       </w:r>
     </w:p>
     <w:p>
@@ -2724,20 +2822,53 @@
     </w:p>
     <w:p>
       <w:pPr>
+        <w:jc w:val="center"/>
+      </w:pPr>
+      <w:r>
+        <w:drawing>
+          <wp:inline xmlns:a="http://schemas.openxmlformats.org/drawingml/2006/main" xmlns:pic="http://schemas.openxmlformats.org/drawingml/2006/picture">
+            <wp:extent cx="4140000" cy="3762225"/>
+            <wp:docPr id="4" name="Picture 4"/>
+            <wp:cNvGraphicFramePr>
+              <a:graphicFrameLocks noChangeAspect="1"/>
+            </wp:cNvGraphicFramePr>
+            <a:graphic>
+              <a:graphicData uri="http://schemas.openxmlformats.org/drawingml/2006/picture">
+                <pic:pic>
+                  <pic:nvPicPr>
+                    <pic:cNvPr id="0" name="mqtt4.jpg"/>
+                    <pic:cNvPicPr/>
+                  </pic:nvPicPr>
+                  <pic:blipFill>
+                    <a:blip r:embed="rId10"/>
+                    <a:stretch>
+                      <a:fillRect/>
+                    </a:stretch>
+                  </pic:blipFill>
+                  <pic:spPr>
+                    <a:xfrm>
+                      <a:off x="0" y="0"/>
+                      <a:ext cx="4140000" cy="3762225"/>
+                    </a:xfrm>
+                    <a:prstGeom prst="rect"/>
+                  </pic:spPr>
+                </pic:pic>
+              </a:graphicData>
+            </a:graphic>
+          </wp:inline>
+        </w:drawing>
+      </w:r>
+    </w:p>
+    <w:p>
+      <w:pPr>
         <w:spacing w:after="80"/>
-        <w:ind w:left="357"/>
-      </w:pPr>
-      <w:r>
-        <w:rPr>
-          <w:color w:val="1A3C8C"/>
-        </w:rPr>
-      </w:r>
-      <w:r>
-        <w:rPr>
-          <w:color w:val="1A3C8C"/>
-          <w:highlight w:val="yellow"/>
-        </w:rPr>
-        <w:t>[вставить скриншот № 4]</w:t>
+        <w:jc w:val="center"/>
+      </w:pPr>
+      <w:r>
+        <w:rPr>
+          <w:sz w:val="20"/>
+        </w:rPr>
+        <w:t>Скриншот № 4. После переподключения (Clean Session = false, QoS 1) пришли все три сообщения 1, 2, 3</w:t>
       </w:r>
     </w:p>
     <w:p>
@@ -2960,7 +3091,7 @@
               <w:rPr>
                 <w:color w:val="1A3C8C"/>
               </w:rPr>
-              <w:t>lab/&lt;ГРУППА&gt;/&lt;N&gt;/telemetry/sector1/air/temperature</w:t>
+              <w:t>lab/67/67/telemetry/sector1/air/temperature</w:t>
             </w:r>
           </w:p>
         </w:tc>
@@ -3013,7 +3144,7 @@
               <w:rPr>
                 <w:color w:val="1A3C8C"/>
               </w:rPr>
-              <w:t>lab/&lt;ГРУППА&gt;/&lt;N&gt;/telemetry/sector2/air/temperature</w:t>
+              <w:t>lab/67/67/telemetry/sector2/air/temperature</w:t>
             </w:r>
           </w:p>
         </w:tc>
@@ -3066,7 +3197,7 @@
               <w:rPr>
                 <w:color w:val="1A3C8C"/>
               </w:rPr>
-              <w:t>lab/&lt;ГРУППА&gt;/&lt;N&gt;/command/sector2/irrigation/set</w:t>
+              <w:t>lab/67/67/command/sector2/irrigation/set</w:t>
             </w:r>
           </w:p>
         </w:tc>
@@ -3120,7 +3251,7 @@
               <w:rPr>
                 <w:color w:val="1A3C8C"/>
               </w:rPr>
-              <w:t>lab/&lt;ГРУППА&gt;/&lt;N&gt;/telemetry/sector1/sensor/status  (Retain; LWT = offline)</w:t>
+              <w:t>lab/67/67/telemetry/sector1/sensor/status  (Retain; LWT = offline)</w:t>
             </w:r>
           </w:p>
         </w:tc>
@@ -3173,7 +3304,7 @@
               <w:rPr>
                 <w:color w:val="1A3C8C"/>
               </w:rPr>
-              <w:t>lab/&lt;ГРУППА&gt;/&lt;N&gt;/telemetry/#</w:t>
+              <w:t>lab/67/67/telemetry/#</w:t>
             </w:r>
           </w:p>
         </w:tc>
@@ -3226,7 +3357,7 @@
               <w:rPr>
                 <w:color w:val="1A3C8C"/>
               </w:rPr>
-              <w:t>lab/&lt;ГРУППА&gt;/&lt;N&gt;/command/sector2/irrigation/set</w:t>
+              <w:t>lab/67/67/command/sector2/irrigation/set</w:t>
             </w:r>
           </w:p>
         </w:tc>

</xml_diff>